<commit_message>
docs: round 4 deep audit followups (Review deep-link + date dark mode)
Two more findings the user caught that I missed:

1. Home page Review button doesn't deep-link to the task card modal.
   Click navigates to the correct kanban board but drops the user
   on a board with N tasks and they have to find the right one.
   Whole point of the Review button is to surface that exact task.
   Added as Home #12 [HIGH].

2. Service kanban card modal date pickers don't adapt to dark mode.
   The picker overlay does exist (clicking the input opens the
   browser's native date picker) but in dark mode the placeholder
   text and calendar icon render near-black on dark, and the
   picker overlay itself stays in light chrome. Refined kanban #15
   from "missing picker" (incorrect) to "dark mode contrast bug"
   with concrete CSS fixes (color-scheme: dark + filter: invert on
   the calendar-picker-indicator).

Co-Authored-By: Claude Opus 4.7 <noreply@anthropic.com>
</commit_message>
<xml_diff>
--- a/docs/qa-comparison/home-page-qa-round4-deep.docx
+++ b/docs/qa-comparison/home-page-qa-round4-deep.docx
@@ -69,7 +69,7 @@
           <w:color w:val="5A5A5A"/>
           <w:sz w:val="22"/>
         </w:rPr>
-        <w:t>Round 4 deep findings: 5 done · 4 open · 2 fyi</w:t>
+        <w:t>Round 4 deep findings: 5 done · 5 open · 2 fyi</w:t>
       </w:r>
     </w:p>
     <w:p>
@@ -944,6 +944,170 @@
           <w:sz w:val="20"/>
         </w:rPr>
         <w:t>Match the icon weight (filled bell). Pull from Heroicons /24/solid/BellIcon if portal is currently using /24/outline.</w:t>
+      </w:r>
+    </w:p>
+    <w:p>
+      <w:pPr>
+        <w:spacing w:after="40"/>
+      </w:pPr>
+    </w:p>
+    <w:tbl>
+      <w:tblPr>
+        <w:tblW w:type="auto" w:w="0"/>
+        <w:tblLayout w:type="fixed"/>
+        <w:tblLook w:firstColumn="1" w:firstRow="1" w:lastColumn="0" w:lastRow="0" w:noHBand="0" w:noVBand="1" w:val="04A0"/>
+      </w:tblPr>
+      <w:tblGrid>
+        <w:gridCol w:w="792"/>
+        <w:gridCol w:w="1368"/>
+        <w:gridCol w:w="7920"/>
+      </w:tblGrid>
+      <w:tr>
+        <w:trPr>
+          <w:trHeight w:val="312"/>
+        </w:trPr>
+        <w:tc>
+          <w:tcPr>
+            <w:tcW w:type="dxa" w:w="792"/>
+            <w:tcBorders>
+              <w:top w:val="nil"/>
+              <w:left w:val="nil"/>
+              <w:bottom w:val="nil"/>
+              <w:right w:val="nil"/>
+            </w:tcBorders>
+            <w:shd w:val="clear" w:color="auto" w:fill="D33B3B"/>
+            <w:vAlign w:val="center"/>
+          </w:tcPr>
+          <w:p>
+            <w:pPr>
+              <w:spacing w:after="0"/>
+              <w:jc w:val="center"/>
+            </w:pPr>
+            <w:r>
+              <w:rPr>
+                <w:b/>
+                <w:color w:val="FFFFFF"/>
+                <w:sz w:val="16"/>
+              </w:rPr>
+              <w:t>HIGH</w:t>
+            </w:r>
+          </w:p>
+        </w:tc>
+        <w:tc>
+          <w:tcPr>
+            <w:tcW w:type="dxa" w:w="1368"/>
+            <w:tcBorders>
+              <w:top w:val="nil"/>
+              <w:left w:val="nil"/>
+              <w:bottom w:val="nil"/>
+              <w:right w:val="nil"/>
+            </w:tcBorders>
+            <w:shd w:val="clear" w:color="auto" w:fill="D33B3B"/>
+            <w:vAlign w:val="center"/>
+          </w:tcPr>
+          <w:p>
+            <w:pPr>
+              <w:spacing w:after="0"/>
+              <w:jc w:val="center"/>
+            </w:pPr>
+            <w:r>
+              <w:rPr>
+                <w:b/>
+                <w:color w:val="FFFFFF"/>
+                <w:sz w:val="16"/>
+              </w:rPr>
+              <w:t>OPEN</w:t>
+            </w:r>
+          </w:p>
+        </w:tc>
+        <w:tc>
+          <w:tcPr>
+            <w:tcW w:type="dxa" w:w="7920"/>
+            <w:tcBorders>
+              <w:top w:val="nil"/>
+              <w:left w:val="nil"/>
+              <w:bottom w:val="nil"/>
+              <w:right w:val="nil"/>
+            </w:tcBorders>
+            <w:vAlign w:val="center"/>
+          </w:tcPr>
+          <w:p>
+            <w:pPr>
+              <w:spacing w:after="0"/>
+            </w:pPr>
+            <w:r>
+              <w:rPr>
+                <w:b/>
+                <w:color w:val="1A1A1A"/>
+                <w:sz w:val="22"/>
+              </w:rPr>
+              <w:t>#12. Review button doesn't deep-link to the task card modal</w:t>
+            </w:r>
+          </w:p>
+        </w:tc>
+      </w:tr>
+    </w:tbl>
+    <w:p>
+      <w:pPr>
+        <w:spacing w:after="60"/>
+        <w:ind w:left="230"/>
+      </w:pPr>
+      <w:r>
+        <w:rPr>
+          <w:b/>
+          <w:color w:val="1A1A1A"/>
+          <w:sz w:val="20"/>
+        </w:rPr>
+        <w:t xml:space="preserve">Where it stood: </w:t>
+      </w:r>
+      <w:r>
+        <w:rPr>
+          <w:color w:val="1A1A1A"/>
+          <w:sz w:val="20"/>
+        </w:rPr>
+        <w:t>Not previously documented. User-flagged in round 4 follow-up.</w:t>
+      </w:r>
+    </w:p>
+    <w:p>
+      <w:pPr>
+        <w:spacing w:after="60"/>
+        <w:ind w:left="230"/>
+      </w:pPr>
+      <w:r>
+        <w:rPr>
+          <w:b/>
+          <w:color w:val="1A1A1A"/>
+          <w:sz w:val="20"/>
+        </w:rPr>
+        <w:t xml:space="preserve">Round 4 status: </w:t>
+      </w:r>
+      <w:r>
+        <w:rPr>
+          <w:color w:val="1A1A1A"/>
+          <w:sz w:val="20"/>
+        </w:rPr>
+        <w:t>Click on Review on a My Tasks card navigates to the correct kanban board (e.g. "Review new ClickUp changes" lands on /board/hubstaff-3795488) but the specific task's card modal does NOT open. The user is dropped on a kanban with 73 tasks and has to scan for the one they were supposed to review. The whole point of the Review button is to surface that exact task.</w:t>
+      </w:r>
+    </w:p>
+    <w:p>
+      <w:pPr>
+        <w:spacing w:after="60"/>
+        <w:ind w:left="230"/>
+      </w:pPr>
+      <w:r>
+        <w:rPr>
+          <w:b/>
+          <w:color w:val="1A1A1A"/>
+          <w:sz w:val="20"/>
+        </w:rPr>
+        <w:t xml:space="preserve">What's left: </w:t>
+      </w:r>
+      <w:r>
+        <w:rPr>
+          <w:color w:val="1A1A1A"/>
+          <w:sz w:val="20"/>
+        </w:rPr>
+        <w:t>Wire Review to deep-link to the card modal. URL pattern matches our build: /board/&lt;serviceId&gt;/card/&lt;cardId&gt;. On board mount, if the URL has a card path, auto-open the matching card modal. App.tsx already has this routing pattern for our build's notifications — same shape applies.</w:t>
       </w:r>
     </w:p>
     <w:p>
@@ -2460,6 +2624,122 @@
         <w:spacing w:after="80"/>
       </w:pPr>
     </w:p>
+    <w:tbl>
+      <w:tblPr>
+        <w:tblW w:type="auto" w:w="0"/>
+        <w:tblLayout w:type="fixed"/>
+        <w:tblLook w:firstColumn="1" w:firstRow="1" w:lastColumn="0" w:lastRow="0" w:noHBand="0" w:noVBand="1" w:val="04A0"/>
+      </w:tblPr>
+      <w:tblGrid>
+        <w:gridCol w:w="461"/>
+        <w:gridCol w:w="792"/>
+        <w:gridCol w:w="8539"/>
+      </w:tblGrid>
+      <w:tr>
+        <w:tc>
+          <w:tcPr>
+            <w:tcW w:type="dxa" w:w="461"/>
+            <w:tcBorders>
+              <w:top w:val="nil"/>
+              <w:left w:val="nil"/>
+              <w:bottom w:val="nil"/>
+              <w:right w:val="nil"/>
+            </w:tcBorders>
+            <w:vAlign w:val="top"/>
+          </w:tcPr>
+          <w:p>
+            <w:pPr>
+              <w:spacing w:after="0"/>
+            </w:pPr>
+            <w:sdt>
+              <w:sdtPr>
+                <w14:checkbox>
+                  <w14:checked w14:val="0"/>
+                  <w14:checkedState w14:val="2612" w14:font="MS Gothic"/>
+                  <w14:uncheckedState w14:val="2610" w14:font="MS Gothic"/>
+                </w14:checkbox>
+              </w:sdtPr>
+              <w:sdtContent>
+                <w:r>
+                  <w:rPr>
+                    <w:rFonts w:ascii="MS Gothic" w:hAnsi="MS Gothic" w:eastAsia="MS Gothic"/>
+                    <w:sz w:val="24"/>
+                  </w:rPr>
+                  <w:t>☐</w:t>
+                </w:r>
+              </w:sdtContent>
+            </w:sdt>
+          </w:p>
+        </w:tc>
+        <w:tc>
+          <w:tcPr>
+            <w:tcW w:type="dxa" w:w="792"/>
+            <w:tcBorders>
+              <w:top w:val="nil"/>
+              <w:left w:val="nil"/>
+              <w:bottom w:val="nil"/>
+              <w:right w:val="nil"/>
+            </w:tcBorders>
+            <w:shd w:val="clear" w:color="auto" w:fill="D33B3B"/>
+            <w:vAlign w:val="top"/>
+          </w:tcPr>
+          <w:p>
+            <w:pPr>
+              <w:spacing w:after="0"/>
+              <w:jc w:val="center"/>
+            </w:pPr>
+            <w:r>
+              <w:rPr>
+                <w:b/>
+                <w:color w:val="FFFFFF"/>
+                <w:sz w:val="16"/>
+              </w:rPr>
+              <w:t>HIGH</w:t>
+            </w:r>
+          </w:p>
+        </w:tc>
+        <w:tc>
+          <w:tcPr>
+            <w:tcW w:type="dxa" w:w="8539"/>
+            <w:tcBorders>
+              <w:top w:val="nil"/>
+              <w:left w:val="nil"/>
+              <w:bottom w:val="nil"/>
+              <w:right w:val="nil"/>
+            </w:tcBorders>
+            <w:vAlign w:val="top"/>
+          </w:tcPr>
+          <w:p>
+            <w:pPr>
+              <w:spacing w:after="0"/>
+            </w:pPr>
+            <w:r>
+              <w:rPr>
+                <w:b/>
+                <w:color w:val="1A1A1A"/>
+                <w:sz w:val="21"/>
+              </w:rPr>
+              <w:t>#12. Review button doesn't deep-link to the task card modal</w:t>
+            </w:r>
+            <w:r>
+              <w:br/>
+            </w:r>
+            <w:r>
+              <w:rPr>
+                <w:color w:val="1A1A1A"/>
+                <w:sz w:val="20"/>
+              </w:rPr>
+              <w:t>Wire Review to deep-link to the card modal. URL pattern matches our build: /board/&lt;serviceId&gt;/card/&lt;cardId&gt;. On board mount, if the URL has a card path, auto-open the matching card modal. App.tsx already has this routing pattern for our build's notifications — same shape applies.</w:t>
+            </w:r>
+          </w:p>
+        </w:tc>
+      </w:tr>
+    </w:tbl>
+    <w:p>
+      <w:pPr>
+        <w:spacing w:after="80"/>
+      </w:pPr>
+    </w:p>
     <w:sectPr>
       <w:pgSz w:w="12240" w:h="15840"/>
       <w:pgMar w:top="1224" w:right="1080" w:bottom="1080" w:left="1080" w:header="720" w:footer="720" w:gutter="0"/>

</xml_diff>